<commit_message>
titles corrected: co-chair ZKP TF (ToIP), member Trusted Agents WG (DIF), co-chair IKP WG (BGIN)
Applied to the concept note header, its built outputs, and the README
team line.

Co-Authored-By: Claude Fable 5 <noreply@anthropic.com>
Claude-Session: https://claude.ai/code/session_01CjfmyV3WfK92zLANYdV7ht
</commit_message>
<xml_diff>
--- a/render/cdir-track4-note/out/kyra-gate-concept-note.docx
+++ b/render/cdir-track4-note/out/kyra-gate-concept-note.docx
@@ -81,7 +81,7 @@
               <w:pStyle w:val="Compact"/>
             </w:pPr>
             <w:r>
-              <w:t xml:space="preserve">mitchell@soulbis.com — engine, model, standards lane ·</w:t>
+              <w:t xml:space="preserve">mitchell@soulbis.com — engine, model, standards lane · member, Trusted Agents WG,</w:t>
             </w:r>
             <w:r>
               <w:t xml:space="preserve"> </w:t>
@@ -100,7 +100,7 @@
               <w:t xml:space="preserve"> </w:t>
             </w:r>
             <w:r>
-              <w:t xml:space="preserve">member, Trusted Agents WG ·</w:t>
+              <w:t xml:space="preserve">·</w:t>
             </w:r>
             <w:r>
               <w:t xml:space="preserve"> </w:t>
@@ -110,7 +110,7 @@
                 <w:b/>
                 <w:bCs/>
               </w:rPr>
-              <w:t xml:space="preserve">chair,</w:t>
+              <w:t xml:space="preserve">co-chair,</w:t>
             </w:r>
             <w:r>
               <w:rPr>

</xml_diff>

<commit_message>
team: Chloe White is a BGIN member — note, outputs, README
Co-Authored-By: Claude Fable 5 <noreply@anthropic.com>
Claude-Session: https://claude.ai/code/session_01CjfmyV3WfK92zLANYdV7ht
</commit_message>
<xml_diff>
--- a/render/cdir-track4-note/out/kyra-gate-concept-note.docx
+++ b/render/cdir-track4-note/out/kyra-gate-concept-note.docx
@@ -308,6 +308,23 @@
                   <w:rStyle w:val="Hyperlink"/>
                 </w:rPr>
                 <w:t xml:space="preserve">chloewhite.info</w:t>
+              </w:r>
+            </w:hyperlink>
+            <w:r>
+              <w:t xml:space="preserve"> </w:t>
+            </w:r>
+            <w:r>
+              <w:t xml:space="preserve">· member,</w:t>
+            </w:r>
+            <w:r>
+              <w:t xml:space="preserve"> </w:t>
+            </w:r>
+            <w:hyperlink r:id="rId12">
+              <w:r>
+                <w:rPr>
+                  <w:rStyle w:val="Hyperlink"/>
+                </w:rPr>
+                <w:t xml:space="preserve">BGIN</w:t>
               </w:r>
             </w:hyperlink>
           </w:p>

</xml_diff>

<commit_message>
team: Chloe White co-chairs BGIN's FASE WG; PDF output realigned
Chloe's line becomes co-chair, Financial Applications and Social
Economics (FASE) WG, BGIN — note, README, and both built outputs. The
committed PDF also catches up with the prior team edit it missed while
the file was viewer-locked.

Co-Authored-By: Claude Fable 5 <noreply@anthropic.com>
Claude-Session: https://claude.ai/code/session_01CjfmyV3WfK92zLANYdV7ht
</commit_message>
<xml_diff>
--- a/render/cdir-track4-note/out/kyra-gate-concept-note.docx
+++ b/render/cdir-track4-note/out/kyra-gate-concept-note.docx
@@ -314,15 +314,31 @@
               <w:t xml:space="preserve"> </w:t>
             </w:r>
             <w:r>
-              <w:t xml:space="preserve">· member,</w:t>
-            </w:r>
-            <w:r>
+              <w:t xml:space="preserve">·</w:t>
+            </w:r>
+            <w:r>
+              <w:t xml:space="preserve"> </w:t>
+            </w:r>
+            <w:r>
+              <w:rPr>
+                <w:b/>
+                <w:bCs/>
+              </w:rPr>
+              <w:t xml:space="preserve">co-chair, Financial Applications and Social Economics (FASE) WG,</w:t>
+            </w:r>
+            <w:r>
+              <w:rPr>
+                <w:b/>
+                <w:bCs/>
+              </w:rPr>
               <w:t xml:space="preserve"> </w:t>
             </w:r>
             <w:hyperlink r:id="rId12">
               <w:r>
                 <w:rPr>
                   <w:rStyle w:val="Hyperlink"/>
+                  <w:b/>
+                  <w:bCs/>
                 </w:rPr>
                 <w:t xml:space="preserve">BGIN</w:t>
               </w:r>

</xml_diff>

<commit_message>
KYRA — Know Your Runtime Agent; David McFadzean as Archon architect; the roads have limits
Three closing rulings. The acronym resolves exactly — KYRA, Know Your
Runtime Agent: the gate verifies what an agent understands and does as
it runs, not what it possesses (note, README, landing, guide). David
McFadzean joins the team lines as Archon architect, the identity
platform beneath Hearthold. And the hitchhiker passage carries
Christian's identification: the hitchhiker's pattern is the
reverse-Google pattern in motion — the query travels to the nodes,
never the data to a centre — with Hearthold's trust-chain attenuation
letting any hearth-keeper refuse a hitchhiker too far from home.
Runtimes green; outputs rebuilt.

Co-Authored-By: Claude Fable 5 <noreply@anthropic.com>
Claude-Session: https://claude.ai/code/session_01CjfmyV3WfK92zLANYdV7ht
</commit_message>
<xml_diff>
--- a/render/cdir-track4-note/out/kyra-gate-concept-note.docx
+++ b/render/cdir-track4-note/out/kyra-gate-concept-note.docx
@@ -269,6 +269,44 @@
                 <w:b/>
                 <w:bCs/>
               </w:rPr>
+              <w:t xml:space="preserve">David McFadzean</w:t>
+            </w:r>
+          </w:p>
+        </w:tc>
+        <w:tc>
+          <w:tcPr/>
+          <w:p>
+            <w:pPr>
+              <w:pStyle w:val="Compact"/>
+            </w:pPr>
+            <w:r>
+              <w:rPr>
+                <w:b/>
+                <w:bCs/>
+              </w:rPr>
+              <w:t xml:space="preserve">Archon architect</w:t>
+            </w:r>
+            <w:r>
+              <w:t xml:space="preserve"> </w:t>
+            </w:r>
+            <w:r>
+              <w:t xml:space="preserve">— the identity platform beneath Hearthold; available to sign releases</w:t>
+            </w:r>
+          </w:p>
+        </w:tc>
+      </w:tr>
+      <w:tr>
+        <w:tc>
+          <w:tcPr/>
+          <w:p>
+            <w:pPr>
+              <w:pStyle w:val="Compact"/>
+            </w:pPr>
+            <w:r>
+              <w:rPr>
+                <w:b/>
+                <w:bCs/>
+              </w:rPr>
               <w:t xml:space="preserve">Chloe White</w:t>
             </w:r>
           </w:p>
@@ -556,7 +594,36 @@
         <w:t xml:space="preserve">the compass, not the captain</w:t>
       </w:r>
       <w:r>
-        <w:t xml:space="preserve">. KY-A — Know Your Agent — keeps her name. And because this is at heart a fintech challenge, the note grounds the same machinery in a market scenario: credit against tokenised real-world assets, where admission at the gate is what creates the pricing premium (§3).</w:t>
+        <w:t xml:space="preserve">. And the name is exact:</w:t>
+      </w:r>
+      <w:r>
+        <w:t xml:space="preserve"> </w:t>
+      </w:r>
+      <w:r>
+        <w:rPr>
+          <w:b/>
+          <w:bCs/>
+        </w:rPr>
+        <w:t xml:space="preserve">KYRA — Know Your Runtime Agent</w:t>
+      </w:r>
+      <w:r>
+        <w:t xml:space="preserve">.</w:t>
+      </w:r>
+      <w:r>
+        <w:t xml:space="preserve"> </w:t>
+      </w:r>
+      <w:r>
+        <w:rPr>
+          <w:i/>
+          <w:iCs/>
+        </w:rPr>
+        <w:t xml:space="preserve">Runtime</w:t>
+      </w:r>
+      <w:r>
+        <w:t xml:space="preserve"> </w:t>
+      </w:r>
+      <w:r>
+        <w:t xml:space="preserve">is the point — the gate verifies what an agent understands and does as it runs, not what it possesses. And because this is at heart a fintech challenge, the note grounds the same machinery in a market scenario: credit against tokenised real-world assets, where admission at the gate is what creates the pricing premium (§3).</w:t>
       </w:r>
     </w:p>
     <w:bookmarkEnd w:id="15"/>
@@ -2054,7 +2121,39 @@
         <w:t xml:space="preserve">hitchhiker</w:t>
       </w:r>
       <w:r>
-        <w:t xml:space="preserve">. A visiting agent — or a traveller’s agent — hitchhikes between hearths and discovers the world, walking the same KY-A ceremony at each door: admitted as a guest with a scoped hand of cards, never the run of the house. Roaming without a platform in the middle — the trust graph’s edges become roads. (The repository’s third persona expression is already named</w:t>
+        <w:t xml:space="preserve">. A visiting agent — or a traveller’s agent — hitchhikes between hearths and discovers the world, walking the same KY-A ceremony at each door: admitted as a guest with a scoped hand of cards, never the run of the house. The hitchhiker’s pattern</w:t>
+      </w:r>
+      <w:r>
+        <w:t xml:space="preserve"> </w:t>
+      </w:r>
+      <w:r>
+        <w:rPr>
+          <w:b/>
+          <w:bCs/>
+        </w:rPr>
+        <w:t xml:space="preserve">is</w:t>
+      </w:r>
+      <w:r>
+        <w:t xml:space="preserve"> </w:t>
+      </w:r>
+      <w:r>
+        <w:t xml:space="preserve">the reverse-Google pattern in motion: the query travels to the nodes; the data never travels to a centre. And the roads have distance — Hearthold’s</w:t>
+      </w:r>
+      <w:r>
+        <w:t xml:space="preserve"> </w:t>
+      </w:r>
+      <w:r>
+        <w:rPr>
+          <w:b/>
+          <w:bCs/>
+        </w:rPr>
+        <w:t xml:space="preserve">trust-chain attenuation</w:t>
+      </w:r>
+      <w:r>
+        <w:t xml:space="preserve"> </w:t>
+      </w:r>
+      <w:r>
+        <w:t xml:space="preserve">lets any hearth-keeper refuse a hitchhiker too far from home (four degrees of separation, say), so hospitality is a policy each node sets, never a default it suffers. Roaming without a platform in the middle — the trust graph’s edges become roads, and the roads have tolls, signs, and neighbourly limits. (The repository’s third persona expression is already named</w:t>
       </w:r>
       <w:r>
         <w:t xml:space="preserve"> </w:t>

</xml_diff>